<commit_message>
Speech: expand graph curve descriptions (slide 14), trim filler
</commit_message>
<xml_diff>
--- a/ТекстВыступления_Воробьев.docx
+++ b/ТекстВыступления_Воробьев.docx
@@ -83,7 +83,7 @@
           <w:szCs w:val="28"/>
           <w:lang w:val="ru-RU"/>
         </w:rPr>
-        <w:t xml:space="preserve">Актуальность темы обусловлена структурной трансформацией рынка пожарной автоматики в 2024–2026 годах: запрет параллельного импорта, технологический сбор на импортную электронику и ужесточение ГОСТ Р 53325-2024 сформировали защищённую нишу для отечественного производства. Цель работы — разработка инвестиционного проекта предприятия по выпуску комбинированных пожарных извещателей с комплексной оценкой экономической эффективности. Для её достижения решены четыре задачи: обоснование целесообразности на основе анализа рынка, выбор показателей эффективности и инструмента моделирования, разработка производственной и организационной модели с автоматизацией контроля качества и построение финансовой модели в Project Expert.</w:t>
+        <w:t xml:space="preserve">Актуальность темы обусловлена трансформацией рынка пожарной автоматики в 2024–2026 годах: запрет параллельного импорта, технологический сбор на импортную электронику и ужесточение ГОСТ Р 53325-2024 сформировали защищённую нишу для отечественного производства. Цель работы — разработка инвестиционного проекта предприятия по выпуску комбинированных пожарных извещателей. Для её достижения решены четыре задачи: анализ рынка, выбор показателей эффективности и инструмента моделирования, разработка производственной и организационной модели и построение финансовой модели в Project Expert.</w:t>
       </w:r>
     </w:p>
     <w:p>
@@ -167,7 +167,7 @@
           <w:szCs w:val="28"/>
           <w:lang w:val="ru-RU"/>
         </w:rPr>
-        <w:t xml:space="preserve">Рыночные лидеры — «Болид» и «Рубеж» — работают на полных SMT-линиях с барьером входа от 120 миллионов рублей. Проектируемое предприятие использует гибридную модель: капиталоёмкий монтаж и литьё корпусов передаются на контрактное производство, а собственные ресурсы концентрируются на операциях с наивысшей добавленной стоимостью. Это снижает барьер входа примерно до 5 миллионов рублей. Ниша свободна, поскольку крупным игрокам невыгодно малосерийное производство, а проект обеспечивает стопроцентный контроль каждого изделия.</w:t>
+        <w:t xml:space="preserve">Рыночные лидеры — «Болид» и «Рубеж» — работают на полных SMT-линиях с барьером входа от 120 миллионов рублей. Проектируемое предприятие использует гибридную модель: капиталоёмкий монтаж и литьё корпусов передаются на контрактное производство, а собственные ресурсы концентрируются на операциях с наивысшей добавленной стоимостью. Это снижает барьер входа до 5 миллионов рублей. Ниша свободна, поскольку крупным игрокам невыгодно малосерийное производство, а проект обеспечивает стопроцентный контроль каждого изделия.</w:t>
       </w:r>
     </w:p>
     <w:p>
@@ -335,7 +335,7 @@
           <w:szCs w:val="28"/>
           <w:lang w:val="ru-RU"/>
         </w:rPr>
-        <w:t xml:space="preserve">Стенд «СИ-ТДК» объединяет аэродинамический дымовой канал и термокамеру теплового канала и обеспечивает стопроцентный выходной контроль каждого изделия вместо выборочного. MES-система ведёт сквозную прослеживаемость по серийному номеру: без цифрового протокола и этикетки изделие не подлежит отгрузке. Это исключает попадание скрытого брака в партию и является ключевым конкурентным преимуществом в сегменте B2B.</w:t>
+        <w:t xml:space="preserve">Стенд «СИ-ТДК» объединяет аэродинамический дымовой канал и термокамеру теплового канала и обеспечивает стопроцентный выходной контроль каждого изделия вместо выборочного. MES-система ведёт сквозную прослеживаемость по серийному номеру: без цифрового протокола изделие не подлежит отгрузке. Это исключает попадание скрытого брака в партию и является ключевым конкурентным преимуществом в сегменте B2B.</w:t>
       </w:r>
     </w:p>
     <w:p>
@@ -545,7 +545,7 @@
           <w:szCs w:val="28"/>
           <w:lang w:val="ru-RU"/>
         </w:rPr>
-        <w:t xml:space="preserve">Финансирование разделено на два источника: 2 миллиона рублей собственных средств и 7 миллионов рублей заёмных по льготной программе 1764 под 12 процентов годовых сроком 35 месяцев с отсрочкой погашения тела долга на 7 месяцев. Проект проходит по программе как микропредприятие приоритетной отрасли — обрабатывающего производства радиоэлектроники. В инвестиционной фазе применяется капитализация процентов, что сохраняет операционную ликвидность на старте.</w:t>
+        <w:t xml:space="preserve">Финансирование разделено на два источника: 2 миллиона рублей собственных средств и 7 миллионов заёмных по льготной программе 1764 под 12 процентов годовых сроком 35 месяцев с отсрочкой погашения тела долга на 7 месяцев. Проект проходит по программе как микропредприятие приоритетной отрасли — производства радиоэлектроники. Капитализация процентов в инвестиционной фазе сохраняет операционную ликвидность на старте.</w:t>
       </w:r>
     </w:p>
     <w:p>
@@ -587,7 +587,7 @@
           <w:szCs w:val="28"/>
           <w:lang w:val="ru-RU"/>
         </w:rPr>
-        <w:t xml:space="preserve">Графики прибылей и убытков и дефицита наличных средств демонстрируют выход проекта на положительный финансовый результат. После завершения инвестиционной фазы накопленный денежный поток переходит из отрицательной зоны в положительную в пределах горизонта планирования.</w:t>
+        <w:t xml:space="preserve">На графике прибылей и убытков основные кривые — чистый объём продаж и валовая прибыль. Первые четыре месяца они равны нулю: идёт инвестиционная фаза без продаж. С июля 2026 года обе кривые растут, а их пилообразный характер отражает сезонность спроса; валовая прибыль устойчиво держится выше линии суммарных прямых издержек, что подтверждает высокую маржинальность. На графике окупаемости ключевая линия — баланс наличности на конец периода: после расходов инвестиционной фазы она снижается, но не уходит в отрицательную зону, то есть кассовых разрывов нет, а затем за счёт операционного денежного потока устойчиво растёт. Точка её разворота вверх соответствует выходу проекта на окупаемость.</w:t>
       </w:r>
     </w:p>
     <w:p>

</xml_diff>